<commit_message>
feat: ingest keeps tables as row records, strips repeated page furniture, generic heading rules
Co-Authored-By: Claude Sonnet 5 <noreply@anthropic.com>
</commit_message>
<xml_diff>
--- a/tests/fixtures/sample.docx
+++ b/tests/fixtures/sample.docx
@@ -15,6 +15,16 @@
     <w:p>
       <w:r>
         <w:t>This document specifies the behaviour of the sample device. It contains no requirements.</w:t>
+      </w:r>
+    </w:p>
+    <w:p>
+      <w:r>
+        <w:t>5 Requirements</w:t>
+      </w:r>
+    </w:p>
+    <w:p>
+      <w:r>
+        <w:t>The following clauses define the requirements for the sample device.</w:t>
       </w:r>
     </w:p>
     <w:p>

</xml_diff>

<commit_message>
fix: ingest sequence rule accepts implied parents and tab-separated titles, rejects stray top-level numbers
Co-Authored-By: Claude Sonnet 5 <noreply@anthropic.com>
</commit_message>
<xml_diff>
--- a/tests/fixtures/sample.docx
+++ b/tests/fixtures/sample.docx
@@ -15,6 +15,16 @@
     <w:p>
       <w:r>
         <w:t>This document specifies the behaviour of the sample device. It contains no requirements.</w:t>
+      </w:r>
+    </w:p>
+    <w:p>
+      <w:r>
+        <w:t>3 Terms and definitions</w:t>
+      </w:r>
+    </w:p>
+    <w:p>
+      <w:r>
+        <w:t>No special terms are used in this document.</w:t>
       </w:r>
     </w:p>
     <w:p>

</xml_diff>

<commit_message>
feat: --no-model flag, table fixture, e2e coverage assertions, README
Prompt tuning: extract.py gained two source_quote bullets ("need to"/"has to"
are not modal verbs; re-read every quote before replying) after the RFC p3
clause gapped three times on a quoted sub-bullet with no modal verb.

Co-Authored-By: Claude Opus 5 (1M context) <noreply@anthropic.com>
</commit_message>
<xml_diff>
--- a/tests/fixtures/sample.docx
+++ b/tests/fixtures/sample.docx
@@ -65,6 +65,123 @@
     <w:p>
       <w:r>
         <w:t>The word "device" means the unit under test. Nothing here is required.</w:t>
+      </w:r>
+    </w:p>
+    <w:p>
+      <w:r>
+        <w:t>5.4 Request parameters</w:t>
+      </w:r>
+    </w:p>
+    <w:tbl>
+      <w:tblPr>
+        <w:tblW w:type="auto" w:w="0"/>
+        <w:tblLook w:firstColumn="1" w:firstRow="1" w:lastColumn="0" w:lastRow="0" w:noHBand="0" w:noVBand="1" w:val="04A0"/>
+      </w:tblPr>
+      <w:tblGrid>
+        <w:gridCol w:w="2880"/>
+        <w:gridCol w:w="2880"/>
+        <w:gridCol w:w="2880"/>
+      </w:tblGrid>
+      <w:tr>
+        <w:tc>
+          <w:tcPr>
+            <w:tcW w:type="dxa" w:w="2880"/>
+          </w:tcPr>
+          <w:p>
+            <w:r>
+              <w:t>Name</w:t>
+            </w:r>
+          </w:p>
+        </w:tc>
+        <w:tc>
+          <w:tcPr>
+            <w:tcW w:type="dxa" w:w="2880"/>
+          </w:tcPr>
+          <w:p>
+            <w:r>
+              <w:t>Presence</w:t>
+            </w:r>
+          </w:p>
+        </w:tc>
+        <w:tc>
+          <w:tcPr>
+            <w:tcW w:type="dxa" w:w="2880"/>
+          </w:tcPr>
+          <w:p>
+            <w:r>
+              <w:t>Type</w:t>
+            </w:r>
+          </w:p>
+        </w:tc>
+      </w:tr>
+      <w:tr>
+        <w:tc>
+          <w:tcPr>
+            <w:tcW w:type="dxa" w:w="2880"/>
+          </w:tcPr>
+          <w:p>
+            <w:r>
+              <w:t>nonce</w:t>
+            </w:r>
+          </w:p>
+        </w:tc>
+        <w:tc>
+          <w:tcPr>
+            <w:tcW w:type="dxa" w:w="2880"/>
+          </w:tcPr>
+          <w:p>
+            <w:r>
+              <w:t>mandatory</w:t>
+            </w:r>
+          </w:p>
+        </w:tc>
+        <w:tc>
+          <w:tcPr>
+            <w:tcW w:type="dxa" w:w="2880"/>
+          </w:tcPr>
+          <w:p>
+            <w:r>
+              <w:t>text string of 16 to 64 characters</w:t>
+            </w:r>
+          </w:p>
+        </w:tc>
+      </w:tr>
+      <w:tr>
+        <w:tc>
+          <w:tcPr>
+            <w:tcW w:type="dxa" w:w="2880"/>
+          </w:tcPr>
+          <w:p>
+            <w:r>
+              <w:t>locale</w:t>
+            </w:r>
+          </w:p>
+        </w:tc>
+        <w:tc>
+          <w:tcPr>
+            <w:tcW w:type="dxa" w:w="2880"/>
+          </w:tcPr>
+          <w:p>
+            <w:r>
+              <w:t>optional</w:t>
+            </w:r>
+          </w:p>
+        </w:tc>
+        <w:tc>
+          <w:tcPr>
+            <w:tcW w:type="dxa" w:w="2880"/>
+          </w:tcPr>
+          <w:p>
+            <w:r>
+              <w:t>BCP 47 language tag</w:t>
+            </w:r>
+          </w:p>
+        </w:tc>
+      </w:tr>
+    </w:tbl>
+    <w:p>
+      <w:r>
+        <w:t>The reader shall reject a request whose nonce is missing.</w:t>
       </w:r>
     </w:p>
     <w:sectPr>

</xml_diff>